<commit_message>
docs: registra aprovacao das decisoes da revisao 02.33 (matriz 2.1.1)
Aprovacao do mantenedor (interina) em 04/10/2026: DEC-011 a DEC-025, ADR OA-008 a OA-011, TS-038 (manter 401), protecao da main opcao C, PP-001 provisorio, retencao de audit_events em 180 dias provisorios.
</commit_message>
<xml_diff>
--- a/ADR-001_Arquitetura_Base_MeuRemedio_v1.5.docx
+++ b/ADR-001_Arquitetura_Base_MeuRemedio_v1.5.docx
@@ -159,7 +159,7 @@
               <w:rPr>
                 <w:b w:val="0"/>
               </w:rPr>
-              <w:t>EM APROVAÇÃO - OA-001 A OA-005 E OA-007 RESOLVIDOS; OA-008 A OA-011 PROPOSTOS; aprovações formais pendentes (seção 15)</w:t>
+              <w:t>APROVADO (interino) em 04/10/2026 - OA-001 A OA-005 E OA-007 RESOLVIDOS; OA-008 A OA-011 APROVADOS; parecer jurídico e de privacidade pendentes (GX-001 a GX-006)</w:t>
             </w:r>
           </w:p>
         </w:tc>
@@ -6657,7 +6657,7 @@
               <w:rPr>
                 <w:b w:val="0"/>
               </w:rPr>
-              <w:t>PROPOSTO - CSRF por double-submit e validação de Origin; cookies mr_session e mr_csrf definidos.</w:t>
+              <w:t>APROVADO - CSRF por double-submit e validação de Origin; cookies mr_session e mr_csrf definidos.</w:t>
             </w:r>
           </w:p>
         </w:tc>
@@ -6681,7 +6681,7 @@
               <w:rPr>
                 <w:b w:val="0"/>
               </w:rPr>
-              <w:t>Alinha ADR §7, AGENTS §14.1 e OpenAPI 02.33.2 (csrfToken e 403). Exige aprovação de Segurança e Privacidade.</w:t>
+              <w:t>Alinha ADR §7, AGENTS §14.1 e OpenAPI 02.33.2 (csrfToken e 403). Aprovado pelo mantenedor (interino); revisão de Segurança e Privacidade recomendada antes da produção.</w:t>
             </w:r>
           </w:p>
         </w:tc>
@@ -6731,7 +6731,7 @@
               <w:rPr>
                 <w:b w:val="0"/>
               </w:rPr>
-              <w:t>PROPOSTO - Argon2id, lista local de senhas comprometidas, bloqueio por HMAC do e-mail e rate limit em PostgreSQL.</w:t>
+              <w:t>APROVADO - Argon2id, lista local de senhas comprometidas, bloqueio por HMAC do e-mail e rate limit em PostgreSQL.</w:t>
             </w:r>
           </w:p>
         </w:tc>
@@ -6805,7 +6805,7 @@
               <w:rPr>
                 <w:b w:val="0"/>
               </w:rPr>
-              <w:t>PROPOSTO - Node 24 LTS, npm, PostgreSQL 17, Terraform, sa-east-1, ECS Fargate e CD por GitHub Actions com OIDC.</w:t>
+              <w:t>APROVADO - Node 24 LTS, npm, PostgreSQL 17, Terraform, sa-east-1, ECS Fargate e CD por GitHub Actions com OIDC.</w:t>
             </w:r>
           </w:p>
         </w:tc>
@@ -6879,7 +6879,7 @@
               <w:rPr>
                 <w:b w:val="0"/>
               </w:rPr>
-              <w:t>PROPOSTO - Modelo físico, tombstone e PerformanceProfile PP-001 v1.</w:t>
+              <w:t>APROVADO - Modelo físico, tombstone e PerformanceProfile PP-001 v1.</w:t>
             </w:r>
           </w:p>
         </w:tc>
@@ -7085,7 +7085,7 @@
     <w:p>
       <w:pPr/>
       <w:r>
-        <w:t>PROPOSTO. Proteção CSRF por double-submit vinculado à sessão: createSession emite o cookie mr_csrf (Secure; SameSite=Lax; legível por JavaScript) com token HMAC derivado do identificador da sessão e de segredo do servidor (Secrets Manager); o cliente reenvia o valor em X-CSRF-Token em toda mutação autenticada (11 operações). O servidor valida também Origin (ou Sec-Fetch-Site) contra a lista de origens do ambiente. O cookie mr_session é HttpOnly, Secure e SameSite=Lax, sem atributo Domain. Falha: 403 CSRF_VALIDATION_FAILED (ERR-015). Web e API operam no mesmo site e CORS não é habilitado para outras origens. O spike S6 valida a jornada.</w:t>
+        <w:t>APROVADO em 04/10/2026 (mantenedor, interino). Proteção CSRF por double-submit vinculado à sessão: createSession emite o cookie mr_csrf (Secure; SameSite=Lax; legível por JavaScript) com token HMAC derivado do identificador da sessão e de segredo do servidor (Secrets Manager); o cliente reenvia o valor em X-CSRF-Token em toda mutação autenticada (11 operações). O servidor valida também Origin (ou Sec-Fetch-Site) contra a lista de origens do ambiente. O cookie mr_session é HttpOnly, Secure e SameSite=Lax, sem atributo Domain. Falha: 403 CSRF_VALIDATION_FAILED (ERR-015). Web e API operam no mesmo site e CORS não é habilitado para outras origens. O spike S6 valida a jornada.</w:t>
       </w:r>
     </w:p>
     <w:p>
@@ -7099,7 +7099,7 @@
     <w:p>
       <w:pPr/>
       <w:r>
-        <w:t>PROPOSTO. Senhas com Argon2id (parâmetros iniciais: 19 MiB de memória, 2 iterações, paralelismo 1, calibrados no spike S7 para p95 de verificação até 500 ms no ambiente-alvo). Lista local e versionada de senhas comprometidas, sem chamada remota. Bloqueio de login por HMAC do e-mail normalizado, inclusive de e-mails inexistentes. Rate limit (RNF-006) com contadores em tabelas PostgreSQL UNLOGGED e janela por chave; WAF na borda é opcional e complementar. Não há Redis nem cache dedicado no MVP; reavaliar pelos gatilhos da seção 13.</w:t>
+        <w:t>APROVADO em 04/10/2026 (mantenedor, interino). Senhas com Argon2id (parâmetros iniciais: 19 MiB de memória, 2 iterações, paralelismo 1, calibrados no spike S7 para p95 de verificação até 500 ms no ambiente-alvo). Lista local e versionada de senhas comprometidas, sem chamada remota. Bloqueio de login por HMAC do e-mail normalizado, inclusive de e-mails inexistentes. Rate limit (RNF-006) com contadores em tabelas PostgreSQL UNLOGGED e janela por chave; WAF na borda é opcional e complementar. Não há Redis nem cache dedicado no MVP; reavaliar pelos gatilhos da seção 13.</w:t>
       </w:r>
     </w:p>
     <w:p>
@@ -7113,7 +7113,7 @@
     <w:p>
       <w:pPr/>
       <w:r>
-        <w:t>PROPOSTO. Toolchain: Node.js 24 (LTS, suporte até 30/04/2028) fixado em .nvmrc, com reavaliação do Node 26 após sua promoção a LTS em outubro de 2026; npm com package-lock.json e npm ci na CI; PostgreSQL 17 no RDS e nos testes (imagem postgres:17). IaC: Terraform, região primária sa-east-1 (São Paulo), sujeita a GX-004 quanto a transferências. Execução: contêineres no ECS Fargate (web, api e worker); o worker de PDF é isolado, com rede restrita e limites de CPU e memória. CD: GitHub Actions com OIDC para a AWS, imagens no ECR, ambientes staging e production, com aprovação manual na promoção para production. Observabilidade: OpenTelemetry com CloudWatch.</w:t>
+        <w:t>APROVADO em 04/10/2026 (mantenedor, interino). Toolchain: Node.js 24 (LTS, suporte até 30/04/2028) fixado em .nvmrc, com reavaliação do Node 26 após sua promoção a LTS em outubro de 2026; npm com package-lock.json e npm ci na CI; PostgreSQL 17 no RDS e nos testes (imagem postgres:17). IaC: Terraform, região primária sa-east-1 (São Paulo), sujeita a GX-004 quanto a transferências. Execução: contêineres no ECS Fargate (web, api e worker); o worker de PDF é isolado, com rede restrita e limites de CPU e memória. CD: GitHub Actions com OIDC para a AWS, imagens no ECR, ambientes staging e production, com aprovação manual na promoção para production. Observabilidade: OpenTelemetry com CloudWatch.</w:t>
       </w:r>
     </w:p>
     <w:p>
@@ -7127,7 +7127,7 @@
     <w:p>
       <w:pPr/>
       <w:r>
-        <w:t>PROPOSTO. O modelo físico e o dicionário completo estão em docs/architecture/DATA_MODEL.md e servem de base aos schemas Drizzle e às migrações SQL, validados contra PostgreSQL real (QG-004). Tombstone: user_id e HMAC-SHA-256 do e-mail normalizado com pepper em KMS, retido por 180 dias, sem impedir novo cadastro (RN-019). O PerformanceProfile PP-001 v1 está em docs/specifications/performance-profile.v1.yaml.</w:t>
+        <w:t>APROVADO em 04/10/2026 (mantenedor, interino). O modelo físico e o dicionário completo estão em docs/architecture/DATA_MODEL.md e servem de base aos schemas Drizzle e às migrações SQL, validados contra PostgreSQL real (QG-004). Tombstone: user_id e HMAC-SHA-256 do e-mail normalizado com pepper em KMS, retido por 180 dias, sem impedir novo cadastro (RN-019). O PerformanceProfile PP-001 v1 está em docs/specifications/performance-profile.v1.yaml.</w:t>
       </w:r>
     </w:p>
     <w:p>
@@ -7140,7 +7140,7 @@
     </w:p>
     <w:p>
       <w:r>
-        <w:t>Esta decisão, na versão 1.5, entra em vigor para a fundação técnica do MeuRemedio. OA-001 a OA-005 e OA-007 estão encerrados. OA-008 a OA-011 permanecem propostos até a aprovação formal das áreas listadas abaixo. OA-006 permanece restrita ao roadmap clínico futuro. Mudanças que contradigam as decisões aprovadas exigem nova ADR que substitua ou complemente este documento.</w:t>
+        <w:t>Esta decisão, na versão 1.5, entra em vigor para a fundação técnica do MeuRemedio. OA-001 a OA-005 e OA-007 estão encerrados. OA-008 a OA-011 foram aprovados em 04/10/2026 pelo mantenedor, em caráter interino, sem prejuízo da revisão de Segurança e Privacidade antes da produção. OA-006 permanece restrita ao roadmap clínico futuro. Mudanças que contradigam as decisões aprovadas exigem nova ADR que substitua ou complemente este documento.</w:t>
       </w:r>
     </w:p>
     <w:tbl>
@@ -7279,7 +7279,7 @@
               <w:rPr>
                 <w:sz w:val="17"/>
               </w:rPr>
-              <w:t>A definir</w:t>
+              <w:t>Carlos Yano (mantenedor, interino)</w:t>
             </w:r>
           </w:p>
         </w:tc>
@@ -7302,7 +7302,7 @@
               <w:rPr>
                 <w:sz w:val="17"/>
               </w:rPr>
-              <w:t>Pendente</w:t>
+              <w:t>Aprovado em 04/10/2026 (interino)</w:t>
             </w:r>
           </w:p>
         </w:tc>
@@ -7353,7 +7353,7 @@
               <w:rPr>
                 <w:sz w:val="17"/>
               </w:rPr>
-              <w:t>A definir</w:t>
+              <w:t>Carlos Yano (mantenedor, interino)</w:t>
             </w:r>
           </w:p>
         </w:tc>
@@ -7377,7 +7377,7 @@
               <w:rPr>
                 <w:sz w:val="17"/>
               </w:rPr>
-              <w:t>Pendente</w:t>
+              <w:t>Aprovado em 04/10/2026 (interino)</w:t>
             </w:r>
           </w:p>
         </w:tc>
@@ -7426,7 +7426,7 @@
               <w:rPr>
                 <w:sz w:val="17"/>
               </w:rPr>
-              <w:t>A definir</w:t>
+              <w:t>Carlos Yano (mantenedor, interino)</w:t>
             </w:r>
           </w:p>
         </w:tc>
@@ -7449,7 +7449,7 @@
               <w:rPr>
                 <w:sz w:val="17"/>
               </w:rPr>
-              <w:t>Pendente</w:t>
+              <w:t>Aprovação técnica interina em 04/10/2026; parecer jurídico e de privacidade pendente</w:t>
             </w:r>
           </w:p>
         </w:tc>
@@ -7500,7 +7500,7 @@
               <w:rPr>
                 <w:sz w:val="17"/>
               </w:rPr>
-              <w:t>A definir</w:t>
+              <w:t>Carlos Yano (mantenedor, interino)</w:t>
             </w:r>
           </w:p>
         </w:tc>
@@ -7524,7 +7524,7 @@
               <w:rPr>
                 <w:sz w:val="17"/>
               </w:rPr>
-              <w:t>Pendente</w:t>
+              <w:t>Aprovado em 04/10/2026 (interino)</w:t>
             </w:r>
           </w:p>
         </w:tc>

</xml_diff>

<commit_message>
feat: OpenAPI 02.33.3 sem 410 em createResponse e com X-Correlation-ID em toda resposta (matriz 2.1.3)
Decisao A e A de 04/10/2026 (GAP-008 e GAP-009). Etapa verde. Matriz 2.1.3, AGENTS 1.4, workflow e validate_all atualizados.
</commit_message>
<xml_diff>
--- a/ADR-001_Arquitetura_Base_MeuRemedio_v1.5.docx
+++ b/ADR-001_Arquitetura_Base_MeuRemedio_v1.5.docx
@@ -404,7 +404,7 @@
               <w:rPr>
                 <w:b w:val="0"/>
               </w:rPr>
-              <w:t>Especificação Funcional 02.33 DEV-FINAL, OpenAPI 02.33.2 e ADR-001 v1.5</w:t>
+              <w:t>Especificação Funcional 02.33 DEV-FINAL, OpenAPI 02.33.3 e ADR-001 v1.5</w:t>
             </w:r>
           </w:p>
         </w:tc>
@@ -677,12 +677,11 @@
             <w:vAlign w:val="center"/>
           </w:tcPr>
           <w:p>
-            <w:r/>
             <w:r>
               <w:rPr>
                 <w:b w:val="0"/>
               </w:rPr>
-              <w:t>OpenAPI 3.1.1 versão 02.33.2 permanece como fonte normativa para rotas, payloads, respostas, concorrência, comandos e testes de contrato.</w:t>
+              <w:t>OpenAPI 3.1.1 versão 02.33.3 permanece como fonte normativa para rotas, payloads, respostas, concorrência, comandos e testes de contrato.</w:t>
             </w:r>
           </w:p>
         </w:tc>
@@ -1941,12 +1940,11 @@
             <w:vAlign w:val="center"/>
           </w:tcPr>
           <w:p>
-            <w:r/>
             <w:r>
               <w:rPr>
                 <w:b w:val="0"/>
               </w:rPr>
-              <w:t>OpenAPI 3.1.1 contract-first, versão normativa 02.33.2</w:t>
+              <w:t>OpenAPI 3.1.1 contract-first, versão normativa 02.33.3</w:t>
             </w:r>
           </w:p>
         </w:tc>
@@ -3227,12 +3225,11 @@
             <w:vAlign w:val="center"/>
           </w:tcPr>
           <w:p>
-            <w:r/>
             <w:r>
               <w:rPr>
                 <w:b w:val="0"/>
               </w:rPr>
-              <w:t>Nenhuma rota ou payload sem correspondência na OpenAPI 02.33.2 normativa. Divergência bloqueia a CI.</w:t>
+              <w:t>Nenhuma rota ou payload sem correspondência na OpenAPI 02.33.3 normativa. Divergência bloqueia a CI.</w:t>
             </w:r>
           </w:p>
         </w:tc>
@@ -4413,7 +4410,7 @@
     </w:p>
     <w:p>
       <w:r>
-        <w:t>Cada teste deve portar os IDs normativos correspondentes. A CI deve falhar quando houver requisito sem teste, referência inexistente ou implementação divergente da OpenAPI 02.33.2.</w:t>
+        <w:t>Cada teste deve portar os IDs normativos correspondentes. A CI deve falhar quando houver requisito sem teste, referência inexistente ou implementação divergente da OpenAPI 02.33.3.</w:t>
       </w:r>
     </w:p>
     <w:p>
@@ -4429,7 +4426,7 @@
         <w:pStyle w:val="ListNumber"/>
       </w:pPr>
       <w:r>
-        <w:t>O agente lê a Especificação Funcional 02.33, a OpenAPI 02.33.2, esta ADR e o AGENTS.md.</w:t>
+        <w:t>O agente lê a Especificação Funcional 02.33, a OpenAPI 02.33.3, esta ADR e o AGENTS.md.</w:t>
       </w:r>
     </w:p>
     <w:p>
@@ -5495,12 +5492,11 @@
             <w:vAlign w:val="center"/>
           </w:tcPr>
           <w:p>
-            <w:r/>
             <w:r>
               <w:rPr>
                 <w:b w:val="0"/>
               </w:rPr>
-              <w:t>NestJS + OpenAPI 3.1.1 (02.33.2)</w:t>
+              <w:t>NestJS + OpenAPI 3.1.1 (02.33.3)</w:t>
             </w:r>
           </w:p>
         </w:tc>
@@ -6602,12 +6598,11 @@
             </w:tcPr>
           </w:tcPr>
           <w:p>
-            <w:r/>
             <w:r>
               <w:rPr>
                 <w:b w:val="0"/>
               </w:rPr>
-              <w:t>Alinha a arquitetura à OpenAPI 02.33.2, elimina expected_row_version do payload e requestBody em DELETE /sessions, e formaliza o estado CANCELED para exportações.</w:t>
+              <w:t>Alinha a arquitetura à OpenAPI 02.33.3, elimina expected_row_version do payload e requestBody em DELETE /sessions, e formaliza o estado CANCELED para exportações.</w:t>
             </w:r>
           </w:p>
         </w:tc>
@@ -6681,7 +6676,7 @@
               <w:rPr>
                 <w:b w:val="0"/>
               </w:rPr>
-              <w:t>Alinha ADR §7, AGENTS §14.1 e OpenAPI 02.33.2 (csrfToken e 403). Aprovado pelo mantenedor (interino); revisão de Segurança e Privacidade recomendada antes da produção.</w:t>
+              <w:t>Alinha ADR §7, AGENTS §14.1 e OpenAPI 02.33.3 (csrfToken e 403). Aprovado pelo mantenedor (interino); revisão de Segurança e Privacidade recomendada antes da produção.</w:t>
             </w:r>
           </w:p>
         </w:tc>
@@ -7015,7 +7010,7 @@
     <w:p>
       <w:pPr/>
       <w:r>
-        <w:t>A OpenAPI 02.33.2 é a fonte normativa da superfície HTTP. Recursos versionados utilizam ETag nas respostas e If-Match nas operações de atualização. O row_version é gerenciado internamente pela persistência e pode ser apresentado nas representações de leitura para rastreabilidade e depuração operacional. Nas operações de escrita, o mecanismo normativo de concorrência é exclusivamente ETag e If-Match. Nenhum cliente deve enviar row_version ou expected_row_version em payloads de criação ou atualização. Divergências de versão retornam VERSION_CONFLICT. A revogação global de sessões é o comando POST /sessions/revocations, exigindo sessão autenticada, reautenticação e Idempotency-Key.</w:t>
+        <w:t>A OpenAPI 02.33.3 é a fonte normativa da superfície HTTP. Recursos versionados utilizam ETag nas respostas e If-Match nas operações de atualização. O row_version é gerenciado internamente pela persistência e pode ser apresentado nas representações de leitura para rastreabilidade e depuração operacional. Nas operações de escrita, o mecanismo normativo de concorrência é exclusivamente ETag e If-Match. Nenhum cliente deve enviar row_version ou expected_row_version em payloads de criação ou atualização. Divergências de versão retornam VERSION_CONFLICT. A revogação global de sessões é o comando POST /sessions/revocations, exigindo sessão autenticada, reautenticação e Idempotency-Key.</w:t>
       </w:r>
     </w:p>
     <w:p>
@@ -7057,7 +7052,7 @@
     <w:p>
       <w:pPr/>
       <w:r>
-        <w:t>A Especificação Funcional 02.33 permanece normativa para regras de negócio, privacidade e estados não definidos no contrato HTTP. A OpenAPI 02.33.2 prevalece para rotas, métodos, cabeçalhos, payloads, schemas, enums, códigos HTTP e operationId. DTOs, clientes, documentação Swagger e testes de contrato devem ser derivados ou validados contra esse arquivo; endpoints fora do contrato são proibidos.</w:t>
+        <w:t>A Especificação Funcional 02.33 permanece normativa para regras de negócio, privacidade e estados não definidos no contrato HTTP. A OpenAPI 02.33.3 prevalece para rotas, métodos, cabeçalhos, payloads, schemas, enums, códigos HTTP e operationId. DTOs, clientes, documentação Swagger e testes de contrato devem ser derivados ou validados contra esse arquivo; endpoints fora do contrato são proibidos.</w:t>
       </w:r>
     </w:p>
     <w:p>

</xml_diff>

<commit_message>
feat: OpenAPI 02.33.4 com 500 INTERNAL_ERROR e 503 em toda operacao (matriz 2.1.4, etapa verde)
DEC-026 / GAP-010 (decisao de 06/10/2026, aprovacao no PR): ERR-016 INTERNAL_ERROR (500) e 503 DEPENDENCY_UNAVAILABLE documentados nas 27 operacoes. Especificacao (ERR-016, DEC-026, nota de revisao) e ADR com referencias vigentes; matriz 2.1.4 com hashes; schema da matriz aceita 26 decisoes; AGENTS 1.5; validate_all e workflow apontam para 02.33.4.

Co-Authored-By: Claude Opus 5.5 <noreply@anthropic.com>
</commit_message>
<xml_diff>
--- a/ADR-001_Arquitetura_Base_MeuRemedio_v1.5.docx
+++ b/ADR-001_Arquitetura_Base_MeuRemedio_v1.5.docx
@@ -404,7 +404,7 @@
               <w:rPr>
                 <w:b w:val="0"/>
               </w:rPr>
-              <w:t>Especificação Funcional 02.33 DEV-FINAL, OpenAPI 02.33.3 e ADR-001 v1.5</w:t>
+              <w:t>Especificação Funcional 02.33 DEV-FINAL, OpenAPI 02.33.4 e ADR-001 v1.5</w:t>
             </w:r>
           </w:p>
         </w:tc>
@@ -681,7 +681,7 @@
               <w:rPr>
                 <w:b w:val="0"/>
               </w:rPr>
-              <w:t>OpenAPI 3.1.1 versão 02.33.3 permanece como fonte normativa para rotas, payloads, respostas, concorrência, comandos e testes de contrato.</w:t>
+              <w:t>OpenAPI 3.1.1 versão 02.33.4 permanece como fonte normativa para rotas, payloads, respostas, concorrência, comandos e testes de contrato.</w:t>
             </w:r>
           </w:p>
         </w:tc>
@@ -1944,7 +1944,7 @@
               <w:rPr>
                 <w:b w:val="0"/>
               </w:rPr>
-              <w:t>OpenAPI 3.1.1 contract-first, versão normativa 02.33.3</w:t>
+              <w:t>OpenAPI 3.1.1 contract-first, versão normativa 02.33.4</w:t>
             </w:r>
           </w:p>
         </w:tc>
@@ -3229,7 +3229,7 @@
               <w:rPr>
                 <w:b w:val="0"/>
               </w:rPr>
-              <w:t>Nenhuma rota ou payload sem correspondência na OpenAPI 02.33.3 normativa. Divergência bloqueia a CI.</w:t>
+              <w:t>Nenhuma rota ou payload sem correspondência na OpenAPI 02.33.4 normativa. Divergência bloqueia a CI.</w:t>
             </w:r>
           </w:p>
         </w:tc>
@@ -4410,7 +4410,7 @@
     </w:p>
     <w:p>
       <w:r>
-        <w:t>Cada teste deve portar os IDs normativos correspondentes. A CI deve falhar quando houver requisito sem teste, referência inexistente ou implementação divergente da OpenAPI 02.33.3.</w:t>
+        <w:t>Cada teste deve portar os IDs normativos correspondentes. A CI deve falhar quando houver requisito sem teste, referência inexistente ou implementação divergente da OpenAPI 02.33.4.</w:t>
       </w:r>
     </w:p>
     <w:p>
@@ -4426,7 +4426,7 @@
         <w:pStyle w:val="ListNumber"/>
       </w:pPr>
       <w:r>
-        <w:t>O agente lê a Especificação Funcional 02.33, a OpenAPI 02.33.3, esta ADR e o AGENTS.md.</w:t>
+        <w:t>O agente lê a Especificação Funcional 02.33, a OpenAPI 02.33.4, esta ADR e o AGENTS.md.</w:t>
       </w:r>
     </w:p>
     <w:p>
@@ -5496,7 +5496,7 @@
               <w:rPr>
                 <w:b w:val="0"/>
               </w:rPr>
-              <w:t>NestJS + OpenAPI 3.1.1 (02.33.3)</w:t>
+              <w:t>NestJS + OpenAPI 3.1.1 (02.33.4)</w:t>
             </w:r>
           </w:p>
         </w:tc>
@@ -7010,7 +7010,7 @@
     <w:p>
       <w:pPr/>
       <w:r>
-        <w:t>A OpenAPI 02.33.3 é a fonte normativa da superfície HTTP. Recursos versionados utilizam ETag nas respostas e If-Match nas operações de atualização. O row_version é gerenciado internamente pela persistência e pode ser apresentado nas representações de leitura para rastreabilidade e depuração operacional. Nas operações de escrita, o mecanismo normativo de concorrência é exclusivamente ETag e If-Match. Nenhum cliente deve enviar row_version ou expected_row_version em payloads de criação ou atualização. Divergências de versão retornam VERSION_CONFLICT. A revogação global de sessões é o comando POST /sessions/revocations, exigindo sessão autenticada, reautenticação e Idempotency-Key.</w:t>
+        <w:t>A OpenAPI 02.33.4 é a fonte normativa da superfície HTTP. Recursos versionados utilizam ETag nas respostas e If-Match nas operações de atualização. O row_version é gerenciado internamente pela persistência e pode ser apresentado nas representações de leitura para rastreabilidade e depuração operacional. Nas operações de escrita, o mecanismo normativo de concorrência é exclusivamente ETag e If-Match. Nenhum cliente deve enviar row_version ou expected_row_version em payloads de criação ou atualização. Divergências de versão retornam VERSION_CONFLICT. A revogação global de sessões é o comando POST /sessions/revocations, exigindo sessão autenticada, reautenticação e Idempotency-Key.</w:t>
       </w:r>
     </w:p>
     <w:p>
@@ -7052,7 +7052,7 @@
     <w:p>
       <w:pPr/>
       <w:r>
-        <w:t>A Especificação Funcional 02.33 permanece normativa para regras de negócio, privacidade e estados não definidos no contrato HTTP. A OpenAPI 02.33.3 prevalece para rotas, métodos, cabeçalhos, payloads, schemas, enums, códigos HTTP e operationId. DTOs, clientes, documentação Swagger e testes de contrato devem ser derivados ou validados contra esse arquivo; endpoints fora do contrato são proibidos.</w:t>
+        <w:t>A Especificação Funcional 02.33 permanece normativa para regras de negócio, privacidade e estados não definidos no contrato HTTP. A OpenAPI 02.33.4 prevalece para rotas, métodos, cabeçalhos, payloads, schemas, enums, códigos HTTP e operationId. DTOs, clientes, documentação Swagger e testes de contrato devem ser derivados ou validados contra esse arquivo; endpoints fora do contrato são proibidos.</w:t>
       </w:r>
     </w:p>
     <w:p>

</xml_diff>

<commit_message>
feat: OpenAPI 02.33.5 com 400 em createSession, revokeAllSessions e requestAccountDeletion (DEC-032, matriz 2.1.8, etapa verde)
Especificacao (DEC-032, referencias vigentes e nota no Anexo C) e ADR com
referencias vigentes; AGENTS 1.6; matriz 2.1.8 com hashes, response_statuses,
ERR-001 e DEC-032; schema da matriz aceita 32 decisoes; validate_all e workflow
apontam para 02.33.5; regra R19 do TS-040.

Co-Authored-By: Claude Opus 5.5 <noreply@anthropic.com>
Claude-Session: https://claude.ai/code/session_01BJTnd9MNpe8S7RcxNmqx1M
</commit_message>
<xml_diff>
--- a/ADR-001_Arquitetura_Base_MeuRemedio_v1.5.docx
+++ b/ADR-001_Arquitetura_Base_MeuRemedio_v1.5.docx
@@ -404,7 +404,7 @@
               <w:rPr>
                 <w:b w:val="0"/>
               </w:rPr>
-              <w:t>Especificação Funcional 02.33 DEV-FINAL, OpenAPI 02.33.4 e ADR-001 v1.5</w:t>
+              <w:t>Especificação Funcional 02.33 DEV-FINAL, OpenAPI 02.33.5 e ADR-001 v1.5</w:t>
             </w:r>
           </w:p>
         </w:tc>
@@ -681,7 +681,7 @@
               <w:rPr>
                 <w:b w:val="0"/>
               </w:rPr>
-              <w:t>OpenAPI 3.1.1 versão 02.33.4 permanece como fonte normativa para rotas, payloads, respostas, concorrência, comandos e testes de contrato.</w:t>
+              <w:t>OpenAPI 3.1.1 versão 02.33.5 permanece como fonte normativa para rotas, payloads, respostas, concorrência, comandos e testes de contrato.</w:t>
             </w:r>
           </w:p>
         </w:tc>
@@ -1944,7 +1944,7 @@
               <w:rPr>
                 <w:b w:val="0"/>
               </w:rPr>
-              <w:t>OpenAPI 3.1.1 contract-first, versão normativa 02.33.4</w:t>
+              <w:t>OpenAPI 3.1.1 contract-first, versão normativa 02.33.5</w:t>
             </w:r>
           </w:p>
         </w:tc>
@@ -3229,7 +3229,7 @@
               <w:rPr>
                 <w:b w:val="0"/>
               </w:rPr>
-              <w:t>Nenhuma rota ou payload sem correspondência na OpenAPI 02.33.4 normativa. Divergência bloqueia a CI.</w:t>
+              <w:t>Nenhuma rota ou payload sem correspondência na OpenAPI 02.33.5 normativa. Divergência bloqueia a CI.</w:t>
             </w:r>
           </w:p>
         </w:tc>
@@ -4410,7 +4410,7 @@
     </w:p>
     <w:p>
       <w:r>
-        <w:t>Cada teste deve portar os IDs normativos correspondentes. A CI deve falhar quando houver requisito sem teste, referência inexistente ou implementação divergente da OpenAPI 02.33.4.</w:t>
+        <w:t>Cada teste deve portar os IDs normativos correspondentes. A CI deve falhar quando houver requisito sem teste, referência inexistente ou implementação divergente da OpenAPI 02.33.5.</w:t>
       </w:r>
     </w:p>
     <w:p>
@@ -4426,7 +4426,7 @@
         <w:pStyle w:val="ListNumber"/>
       </w:pPr>
       <w:r>
-        <w:t>O agente lê a Especificação Funcional 02.33, a OpenAPI 02.33.4, esta ADR e o AGENTS.md.</w:t>
+        <w:t>O agente lê a Especificação Funcional 02.33, a OpenAPI 02.33.5, esta ADR e o AGENTS.md.</w:t>
       </w:r>
     </w:p>
     <w:p>
@@ -5496,7 +5496,7 @@
               <w:rPr>
                 <w:b w:val="0"/>
               </w:rPr>
-              <w:t>NestJS + OpenAPI 3.1.1 (02.33.4)</w:t>
+              <w:t>NestJS + OpenAPI 3.1.1 (02.33.5)</w:t>
             </w:r>
           </w:p>
         </w:tc>
@@ -7010,7 +7010,7 @@
     <w:p>
       <w:pPr/>
       <w:r>
-        <w:t>A OpenAPI 02.33.4 é a fonte normativa da superfície HTTP. Recursos versionados utilizam ETag nas respostas e If-Match nas operações de atualização. O row_version é gerenciado internamente pela persistência e pode ser apresentado nas representações de leitura para rastreabilidade e depuração operacional. Nas operações de escrita, o mecanismo normativo de concorrência é exclusivamente ETag e If-Match. Nenhum cliente deve enviar row_version ou expected_row_version em payloads de criação ou atualização. Divergências de versão retornam VERSION_CONFLICT. A revogação global de sessões é o comando POST /sessions/revocations, exigindo sessão autenticada, reautenticação e Idempotency-Key.</w:t>
+        <w:t>A OpenAPI 02.33.5 é a fonte normativa da superfície HTTP. Recursos versionados utilizam ETag nas respostas e If-Match nas operações de atualização. O row_version é gerenciado internamente pela persistência e pode ser apresentado nas representações de leitura para rastreabilidade e depuração operacional. Nas operações de escrita, o mecanismo normativo de concorrência é exclusivamente ETag e If-Match. Nenhum cliente deve enviar row_version ou expected_row_version em payloads de criação ou atualização. Divergências de versão retornam VERSION_CONFLICT. A revogação global de sessões é o comando POST /sessions/revocations, exigindo sessão autenticada, reautenticação e Idempotency-Key.</w:t>
       </w:r>
     </w:p>
     <w:p>
@@ -7052,7 +7052,7 @@
     <w:p>
       <w:pPr/>
       <w:r>
-        <w:t>A Especificação Funcional 02.33 permanece normativa para regras de negócio, privacidade e estados não definidos no contrato HTTP. A OpenAPI 02.33.4 prevalece para rotas, métodos, cabeçalhos, payloads, schemas, enums, códigos HTTP e operationId. DTOs, clientes, documentação Swagger e testes de contrato devem ser derivados ou validados contra esse arquivo; endpoints fora do contrato são proibidos.</w:t>
+        <w:t>A Especificação Funcional 02.33 permanece normativa para regras de negócio, privacidade e estados não definidos no contrato HTTP. A OpenAPI 02.33.5 prevalece para rotas, métodos, cabeçalhos, payloads, schemas, enums, códigos HTTP e operationId. DTOs, clientes, documentação Swagger e testes de contrato devem ser derivados ou validados contra esse arquivo; endpoints fora do contrato são proibidos.</w:t>
       </w:r>
     </w:p>
     <w:p>

</xml_diff>

<commit_message>
feat: listExports com a lista de exportacoes do titular, DEC-034 (etapa verde)
OpenAPI 02.33.6 (GET /exports), AGENTS 1.7, matriz 2.1.11, migracao 0010 com o
indice da listagem e exportacoes recentes na tela TL-007.

Co-Authored-By: Claude Opus 5.5 <noreply@anthropic.com>
</commit_message>
<xml_diff>
--- a/ADR-001_Arquitetura_Base_MeuRemedio_v1.5.docx
+++ b/ADR-001_Arquitetura_Base_MeuRemedio_v1.5.docx
@@ -404,7 +404,7 @@
               <w:rPr>
                 <w:b w:val="0"/>
               </w:rPr>
-              <w:t>Especificação Funcional 02.33 DEV-FINAL, OpenAPI 02.33.5 e ADR-001 v1.5</w:t>
+              <w:t xml:space="preserve">Especificação Funcional 02.33 DEV-FINAL, OpenAPI 02.33.6 e ADR-001 v1.5</w:t>
             </w:r>
           </w:p>
         </w:tc>
@@ -681,7 +681,7 @@
               <w:rPr>
                 <w:b w:val="0"/>
               </w:rPr>
-              <w:t>OpenAPI 3.1.1 versão 02.33.5 permanece como fonte normativa para rotas, payloads, respostas, concorrência, comandos e testes de contrato.</w:t>
+              <w:t xml:space="preserve">OpenAPI 3.1.1 versão 02.33.6 permanece como fonte normativa para rotas, payloads, respostas, concorrência, comandos e testes de contrato.</w:t>
             </w:r>
           </w:p>
         </w:tc>
@@ -1944,7 +1944,7 @@
               <w:rPr>
                 <w:b w:val="0"/>
               </w:rPr>
-              <w:t>OpenAPI 3.1.1 contract-first, versão normativa 02.33.5</w:t>
+              <w:t xml:space="preserve">OpenAPI 3.1.1 contract-first, versão normativa 02.33.6</w:t>
             </w:r>
           </w:p>
         </w:tc>
@@ -3229,7 +3229,7 @@
               <w:rPr>
                 <w:b w:val="0"/>
               </w:rPr>
-              <w:t>Nenhuma rota ou payload sem correspondência na OpenAPI 02.33.5 normativa. Divergência bloqueia a CI.</w:t>
+              <w:t xml:space="preserve">Nenhuma rota ou payload sem correspondência na OpenAPI 02.33.6 normativa. Divergência bloqueia a CI.</w:t>
             </w:r>
           </w:p>
         </w:tc>
@@ -4410,7 +4410,7 @@
     </w:p>
     <w:p>
       <w:r>
-        <w:t>Cada teste deve portar os IDs normativos correspondentes. A CI deve falhar quando houver requisito sem teste, referência inexistente ou implementação divergente da OpenAPI 02.33.5.</w:t>
+        <w:t xml:space="preserve">Cada teste deve portar os IDs normativos correspondentes. A CI deve falhar quando houver requisito sem teste, referência inexistente ou implementação divergente da OpenAPI 02.33.6.</w:t>
       </w:r>
     </w:p>
     <w:p>
@@ -4426,7 +4426,7 @@
         <w:pStyle w:val="ListNumber"/>
       </w:pPr>
       <w:r>
-        <w:t>O agente lê a Especificação Funcional 02.33, a OpenAPI 02.33.5, esta ADR e o AGENTS.md.</w:t>
+        <w:t xml:space="preserve">O agente lê a Especificação Funcional 02.33, a OpenAPI 02.33.6, esta ADR e o AGENTS.md.</w:t>
       </w:r>
     </w:p>
     <w:p>
@@ -5496,7 +5496,7 @@
               <w:rPr>
                 <w:b w:val="0"/>
               </w:rPr>
-              <w:t>NestJS + OpenAPI 3.1.1 (02.33.5)</w:t>
+              <w:t xml:space="preserve">NestJS + OpenAPI 3.1.1 (02.33.6)</w:t>
             </w:r>
           </w:p>
         </w:tc>
@@ -7010,7 +7010,7 @@
     <w:p>
       <w:pPr/>
       <w:r>
-        <w:t>A OpenAPI 02.33.5 é a fonte normativa da superfície HTTP. Recursos versionados utilizam ETag nas respostas e If-Match nas operações de atualização. O row_version é gerenciado internamente pela persistência e pode ser apresentado nas representações de leitura para rastreabilidade e depuração operacional. Nas operações de escrita, o mecanismo normativo de concorrência é exclusivamente ETag e If-Match. Nenhum cliente deve enviar row_version ou expected_row_version em payloads de criação ou atualização. Divergências de versão retornam VERSION_CONFLICT. A revogação global de sessões é o comando POST /sessions/revocations, exigindo sessão autenticada, reautenticação e Idempotency-Key.</w:t>
+        <w:t xml:space="preserve">A OpenAPI 02.33.6 é a fonte normativa da superfície HTTP. Recursos versionados utilizam ETag nas respostas e If-Match nas operações de atualização. O row_version é gerenciado internamente pela persistência e pode ser apresentado nas representações de leitura para rastreabilidade e depuração operacional. Nas operações de escrita, o mecanismo normativo de concorrência é exclusivamente ETag e If-Match. Nenhum cliente deve enviar row_version ou expected_row_version em payloads de criação ou atualização. Divergências de versão retornam VERSION_CONFLICT. A revogação global de sessões é o comando POST /sessions/revocations, exigindo sessão autenticada, reautenticação e Idempotency-Key.</w:t>
       </w:r>
     </w:p>
     <w:p>
@@ -7052,7 +7052,7 @@
     <w:p>
       <w:pPr/>
       <w:r>
-        <w:t>A Especificação Funcional 02.33 permanece normativa para regras de negócio, privacidade e estados não definidos no contrato HTTP. A OpenAPI 02.33.5 prevalece para rotas, métodos, cabeçalhos, payloads, schemas, enums, códigos HTTP e operationId. DTOs, clientes, documentação Swagger e testes de contrato devem ser derivados ou validados contra esse arquivo; endpoints fora do contrato são proibidos.</w:t>
+        <w:t xml:space="preserve">A Especificação Funcional 02.33 permanece normativa para regras de negócio, privacidade e estados não definidos no contrato HTTP. A OpenAPI 02.33.6 prevalece para rotas, métodos, cabeçalhos, payloads, schemas, enums, códigos HTTP e operationId. DTOs, clientes, documentação Swagger e testes de contrato devem ser derivados ou validados contra esse arquivo; endpoints fora do contrato são proibidos.</w:t>
       </w:r>
     </w:p>
     <w:p>

</xml_diff>

<commit_message>
feat: remedios do dia na tela Hoje com local_date em listOccurrences, DEC-035 (etapa verde)
OpenAPI 02.33.7 (parametro opcional local_date), AGENTS 1.8, matriz 2.1.14,
Especificacao com a DEC-035 e a nota no Anexo C. A tela Hoje ganha a secao
Remedios de hoje, so para consulta, atualizada junto com Para registrar.

Co-Authored-By: Claude Opus 5.5 <noreply@anthropic.com>
Claude-Session: https://claude.ai/code/session_017rNdJdRa9XB8JBA3acJ1wU
</commit_message>
<xml_diff>
--- a/ADR-001_Arquitetura_Base_MeuRemedio_v1.5.docx
+++ b/ADR-001_Arquitetura_Base_MeuRemedio_v1.5.docx
@@ -404,7 +404,7 @@
               <w:rPr>
                 <w:b w:val="0"/>
               </w:rPr>
-              <w:t xml:space="preserve">Especificação Funcional 02.33 DEV-FINAL, OpenAPI 02.33.6 e ADR-001 v1.5</w:t>
+              <w:t>Especificação Funcional 02.33 DEV-FINAL, OpenAPI 02.33.7 e ADR-001 v1.5</w:t>
             </w:r>
           </w:p>
         </w:tc>
@@ -681,7 +681,7 @@
               <w:rPr>
                 <w:b w:val="0"/>
               </w:rPr>
-              <w:t xml:space="preserve">OpenAPI 3.1.1 versão 02.33.6 permanece como fonte normativa para rotas, payloads, respostas, concorrência, comandos e testes de contrato.</w:t>
+              <w:t>OpenAPI 3.1.1 versão 02.33.7 permanece como fonte normativa para rotas, payloads, respostas, concorrência, comandos e testes de contrato.</w:t>
             </w:r>
           </w:p>
         </w:tc>
@@ -1944,7 +1944,7 @@
               <w:rPr>
                 <w:b w:val="0"/>
               </w:rPr>
-              <w:t xml:space="preserve">OpenAPI 3.1.1 contract-first, versão normativa 02.33.6</w:t>
+              <w:t>OpenAPI 3.1.1 contract-first, versão normativa 02.33.7</w:t>
             </w:r>
           </w:p>
         </w:tc>
@@ -3229,7 +3229,7 @@
               <w:rPr>
                 <w:b w:val="0"/>
               </w:rPr>
-              <w:t xml:space="preserve">Nenhuma rota ou payload sem correspondência na OpenAPI 02.33.6 normativa. Divergência bloqueia a CI.</w:t>
+              <w:t>Nenhuma rota ou payload sem correspondência na OpenAPI 02.33.7 normativa. Divergência bloqueia a CI.</w:t>
             </w:r>
           </w:p>
         </w:tc>
@@ -4410,7 +4410,7 @@
     </w:p>
     <w:p>
       <w:r>
-        <w:t xml:space="preserve">Cada teste deve portar os IDs normativos correspondentes. A CI deve falhar quando houver requisito sem teste, referência inexistente ou implementação divergente da OpenAPI 02.33.6.</w:t>
+        <w:t>Cada teste deve portar os IDs normativos correspondentes. A CI deve falhar quando houver requisito sem teste, referência inexistente ou implementação divergente da OpenAPI 02.33.7.</w:t>
       </w:r>
     </w:p>
     <w:p>
@@ -4426,7 +4426,7 @@
         <w:pStyle w:val="ListNumber"/>
       </w:pPr>
       <w:r>
-        <w:t xml:space="preserve">O agente lê a Especificação Funcional 02.33, a OpenAPI 02.33.6, esta ADR e o AGENTS.md.</w:t>
+        <w:t>O agente lê a Especificação Funcional 02.33, a OpenAPI 02.33.7, esta ADR e o AGENTS.md.</w:t>
       </w:r>
     </w:p>
     <w:p>
@@ -5496,7 +5496,7 @@
               <w:rPr>
                 <w:b w:val="0"/>
               </w:rPr>
-              <w:t xml:space="preserve">NestJS + OpenAPI 3.1.1 (02.33.6)</w:t>
+              <w:t>NestJS + OpenAPI 3.1.1 (02.33.7)</w:t>
             </w:r>
           </w:p>
         </w:tc>
@@ -7010,7 +7010,7 @@
     <w:p>
       <w:pPr/>
       <w:r>
-        <w:t xml:space="preserve">A OpenAPI 02.33.6 é a fonte normativa da superfície HTTP. Recursos versionados utilizam ETag nas respostas e If-Match nas operações de atualização. O row_version é gerenciado internamente pela persistência e pode ser apresentado nas representações de leitura para rastreabilidade e depuração operacional. Nas operações de escrita, o mecanismo normativo de concorrência é exclusivamente ETag e If-Match. Nenhum cliente deve enviar row_version ou expected_row_version em payloads de criação ou atualização. Divergências de versão retornam VERSION_CONFLICT. A revogação global de sessões é o comando POST /sessions/revocations, exigindo sessão autenticada, reautenticação e Idempotency-Key.</w:t>
+        <w:t>A OpenAPI 02.33.7 é a fonte normativa da superfície HTTP. Recursos versionados utilizam ETag nas respostas e If-Match nas operações de atualização. O row_version é gerenciado internamente pela persistência e pode ser apresentado nas representações de leitura para rastreabilidade e depuração operacional. Nas operações de escrita, o mecanismo normativo de concorrência é exclusivamente ETag e If-Match. Nenhum cliente deve enviar row_version ou expected_row_version em payloads de criação ou atualização. Divergências de versão retornam VERSION_CONFLICT. A revogação global de sessões é o comando POST /sessions/revocations, exigindo sessão autenticada, reautenticação e Idempotency-Key.</w:t>
       </w:r>
     </w:p>
     <w:p>
@@ -7052,7 +7052,7 @@
     <w:p>
       <w:pPr/>
       <w:r>
-        <w:t xml:space="preserve">A Especificação Funcional 02.33 permanece normativa para regras de negócio, privacidade e estados não definidos no contrato HTTP. A OpenAPI 02.33.6 prevalece para rotas, métodos, cabeçalhos, payloads, schemas, enums, códigos HTTP e operationId. DTOs, clientes, documentação Swagger e testes de contrato devem ser derivados ou validados contra esse arquivo; endpoints fora do contrato são proibidos.</w:t>
+        <w:t>A Especificação Funcional 02.33 permanece normativa para regras de negócio, privacidade e estados não definidos no contrato HTTP. A OpenAPI 02.33.7 prevalece para rotas, métodos, cabeçalhos, payloads, schemas, enums, códigos HTTP e operationId. DTOs, clientes, documentação Swagger e testes de contrato devem ser derivados ou validados contra esse arquivo; endpoints fora do contrato são proibidos.</w:t>
       </w:r>
     </w:p>
     <w:p>

</xml_diff>

<commit_message>
docs: DEC-036 situacao do plano (OpenAPI 02.33.8, AGENTS 1.9, matriz 2.1.15)
Co-Authored-By: Claude Opus 5.5 <noreply@anthropic.com>
Claude-Session: https://claude.ai/code/session_017rNdJgpe4PD9X2bVXfNRL5
</commit_message>
<xml_diff>
--- a/ADR-001_Arquitetura_Base_MeuRemedio_v1.5.docx
+++ b/ADR-001_Arquitetura_Base_MeuRemedio_v1.5.docx
@@ -404,7 +404,7 @@
               <w:rPr>
                 <w:b w:val="0"/>
               </w:rPr>
-              <w:t>Especificação Funcional 02.33 DEV-FINAL, OpenAPI 02.33.7 e ADR-001 v1.5</w:t>
+              <w:t>Especificação Funcional 02.33 DEV-FINAL, OpenAPI 02.33.8 e ADR-001 v1.5</w:t>
             </w:r>
           </w:p>
         </w:tc>
@@ -681,7 +681,7 @@
               <w:rPr>
                 <w:b w:val="0"/>
               </w:rPr>
-              <w:t>OpenAPI 3.1.1 versão 02.33.7 permanece como fonte normativa para rotas, payloads, respostas, concorrência, comandos e testes de contrato.</w:t>
+              <w:t>OpenAPI 3.1.1 versão 02.33.8 permanece como fonte normativa para rotas, payloads, respostas, concorrência, comandos e testes de contrato.</w:t>
             </w:r>
           </w:p>
         </w:tc>
@@ -1944,7 +1944,7 @@
               <w:rPr>
                 <w:b w:val="0"/>
               </w:rPr>
-              <w:t>OpenAPI 3.1.1 contract-first, versão normativa 02.33.7</w:t>
+              <w:t>OpenAPI 3.1.1 contract-first, versão normativa 02.33.8</w:t>
             </w:r>
           </w:p>
         </w:tc>
@@ -3229,7 +3229,7 @@
               <w:rPr>
                 <w:b w:val="0"/>
               </w:rPr>
-              <w:t>Nenhuma rota ou payload sem correspondência na OpenAPI 02.33.7 normativa. Divergência bloqueia a CI.</w:t>
+              <w:t>Nenhuma rota ou payload sem correspondência na OpenAPI 02.33.8 normativa. Divergência bloqueia a CI.</w:t>
             </w:r>
           </w:p>
         </w:tc>
@@ -4410,7 +4410,7 @@
     </w:p>
     <w:p>
       <w:r>
-        <w:t>Cada teste deve portar os IDs normativos correspondentes. A CI deve falhar quando houver requisito sem teste, referência inexistente ou implementação divergente da OpenAPI 02.33.7.</w:t>
+        <w:t>Cada teste deve portar os IDs normativos correspondentes. A CI deve falhar quando houver requisito sem teste, referência inexistente ou implementação divergente da OpenAPI 02.33.8.</w:t>
       </w:r>
     </w:p>
     <w:p>
@@ -4426,7 +4426,7 @@
         <w:pStyle w:val="ListNumber"/>
       </w:pPr>
       <w:r>
-        <w:t>O agente lê a Especificação Funcional 02.33, a OpenAPI 02.33.7, esta ADR e o AGENTS.md.</w:t>
+        <w:t>O agente lê a Especificação Funcional 02.33, a OpenAPI 02.33.8, esta ADR e o AGENTS.md.</w:t>
       </w:r>
     </w:p>
     <w:p>
@@ -5496,7 +5496,7 @@
               <w:rPr>
                 <w:b w:val="0"/>
               </w:rPr>
-              <w:t>NestJS + OpenAPI 3.1.1 (02.33.7)</w:t>
+              <w:t>NestJS + OpenAPI 3.1.1 (02.33.8)</w:t>
             </w:r>
           </w:p>
         </w:tc>
@@ -7010,7 +7010,7 @@
     <w:p>
       <w:pPr/>
       <w:r>
-        <w:t>A OpenAPI 02.33.7 é a fonte normativa da superfície HTTP. Recursos versionados utilizam ETag nas respostas e If-Match nas operações de atualização. O row_version é gerenciado internamente pela persistência e pode ser apresentado nas representações de leitura para rastreabilidade e depuração operacional. Nas operações de escrita, o mecanismo normativo de concorrência é exclusivamente ETag e If-Match. Nenhum cliente deve enviar row_version ou expected_row_version em payloads de criação ou atualização. Divergências de versão retornam VERSION_CONFLICT. A revogação global de sessões é o comando POST /sessions/revocations, exigindo sessão autenticada, reautenticação e Idempotency-Key.</w:t>
+        <w:t>A OpenAPI 02.33.8 é a fonte normativa da superfície HTTP. Recursos versionados utilizam ETag nas respostas e If-Match nas operações de atualização. O row_version é gerenciado internamente pela persistência e pode ser apresentado nas representações de leitura para rastreabilidade e depuração operacional. Nas operações de escrita, o mecanismo normativo de concorrência é exclusivamente ETag e If-Match. Nenhum cliente deve enviar row_version ou expected_row_version em payloads de criação ou atualização. Divergências de versão retornam VERSION_CONFLICT. A revogação global de sessões é o comando POST /sessions/revocations, exigindo sessão autenticada, reautenticação e Idempotency-Key.</w:t>
       </w:r>
     </w:p>
     <w:p>
@@ -7052,7 +7052,7 @@
     <w:p>
       <w:pPr/>
       <w:r>
-        <w:t>A Especificação Funcional 02.33 permanece normativa para regras de negócio, privacidade e estados não definidos no contrato HTTP. A OpenAPI 02.33.7 prevalece para rotas, métodos, cabeçalhos, payloads, schemas, enums, códigos HTTP e operationId. DTOs, clientes, documentação Swagger e testes de contrato devem ser derivados ou validados contra esse arquivo; endpoints fora do contrato são proibidos.</w:t>
+        <w:t>A Especificação Funcional 02.33 permanece normativa para regras de negócio, privacidade e estados não definidos no contrato HTTP. A OpenAPI 02.33.8 prevalece para rotas, métodos, cabeçalhos, payloads, schemas, enums, códigos HTTP e operationId. DTOs, clientes, documentação Swagger e testes de contrato devem ser derivados ou validados contra esse arquivo; endpoints fora do contrato são proibidos.</w:t>
       </w:r>
     </w:p>
     <w:p>

</xml_diff>

<commit_message>
docs: DEC-037 periodicidade do plano (OpenAPI 02.33.9, AGENTS 1.10, matriz 2.1.16)
Co-Authored-By: Claude Opus 5.5 <noreply@anthropic.com>
Claude-Session: https://claude.ai/code/session_017rNdJgpe4PD9X2bVXfNRL5
</commit_message>
<xml_diff>
--- a/ADR-001_Arquitetura_Base_MeuRemedio_v1.5.docx
+++ b/ADR-001_Arquitetura_Base_MeuRemedio_v1.5.docx
@@ -404,7 +404,7 @@
               <w:rPr>
                 <w:b w:val="0"/>
               </w:rPr>
-              <w:t>Especificação Funcional 02.33 DEV-FINAL, OpenAPI 02.33.8 e ADR-001 v1.5</w:t>
+              <w:t>Especificação Funcional 02.33 DEV-FINAL, OpenAPI 02.33.9 e ADR-001 v1.5</w:t>
             </w:r>
           </w:p>
         </w:tc>
@@ -681,7 +681,7 @@
               <w:rPr>
                 <w:b w:val="0"/>
               </w:rPr>
-              <w:t>OpenAPI 3.1.1 versão 02.33.8 permanece como fonte normativa para rotas, payloads, respostas, concorrência, comandos e testes de contrato.</w:t>
+              <w:t>OpenAPI 3.1.1 versão 02.33.9 permanece como fonte normativa para rotas, payloads, respostas, concorrência, comandos e testes de contrato.</w:t>
             </w:r>
           </w:p>
         </w:tc>
@@ -1944,7 +1944,7 @@
               <w:rPr>
                 <w:b w:val="0"/>
               </w:rPr>
-              <w:t>OpenAPI 3.1.1 contract-first, versão normativa 02.33.8</w:t>
+              <w:t>OpenAPI 3.1.1 contract-first, versão normativa 02.33.9</w:t>
             </w:r>
           </w:p>
         </w:tc>
@@ -3229,7 +3229,7 @@
               <w:rPr>
                 <w:b w:val="0"/>
               </w:rPr>
-              <w:t>Nenhuma rota ou payload sem correspondência na OpenAPI 02.33.8 normativa. Divergência bloqueia a CI.</w:t>
+              <w:t>Nenhuma rota ou payload sem correspondência na OpenAPI 02.33.9 normativa. Divergência bloqueia a CI.</w:t>
             </w:r>
           </w:p>
         </w:tc>
@@ -4410,7 +4410,7 @@
     </w:p>
     <w:p>
       <w:r>
-        <w:t>Cada teste deve portar os IDs normativos correspondentes. A CI deve falhar quando houver requisito sem teste, referência inexistente ou implementação divergente da OpenAPI 02.33.8.</w:t>
+        <w:t>Cada teste deve portar os IDs normativos correspondentes. A CI deve falhar quando houver requisito sem teste, referência inexistente ou implementação divergente da OpenAPI 02.33.9.</w:t>
       </w:r>
     </w:p>
     <w:p>
@@ -4426,7 +4426,7 @@
         <w:pStyle w:val="ListNumber"/>
       </w:pPr>
       <w:r>
-        <w:t>O agente lê a Especificação Funcional 02.33, a OpenAPI 02.33.8, esta ADR e o AGENTS.md.</w:t>
+        <w:t>O agente lê a Especificação Funcional 02.33, a OpenAPI 02.33.9, esta ADR e o AGENTS.md.</w:t>
       </w:r>
     </w:p>
     <w:p>
@@ -5496,7 +5496,7 @@
               <w:rPr>
                 <w:b w:val="0"/>
               </w:rPr>
-              <w:t>NestJS + OpenAPI 3.1.1 (02.33.8)</w:t>
+              <w:t>NestJS + OpenAPI 3.1.1 (02.33.9)</w:t>
             </w:r>
           </w:p>
         </w:tc>
@@ -7010,7 +7010,7 @@
     <w:p>
       <w:pPr/>
       <w:r>
-        <w:t>A OpenAPI 02.33.8 é a fonte normativa da superfície HTTP. Recursos versionados utilizam ETag nas respostas e If-Match nas operações de atualização. O row_version é gerenciado internamente pela persistência e pode ser apresentado nas representações de leitura para rastreabilidade e depuração operacional. Nas operações de escrita, o mecanismo normativo de concorrência é exclusivamente ETag e If-Match. Nenhum cliente deve enviar row_version ou expected_row_version em payloads de criação ou atualização. Divergências de versão retornam VERSION_CONFLICT. A revogação global de sessões é o comando POST /sessions/revocations, exigindo sessão autenticada, reautenticação e Idempotency-Key.</w:t>
+        <w:t>A OpenAPI 02.33.9 é a fonte normativa da superfície HTTP. Recursos versionados utilizam ETag nas respostas e If-Match nas operações de atualização. O row_version é gerenciado internamente pela persistência e pode ser apresentado nas representações de leitura para rastreabilidade e depuração operacional. Nas operações de escrita, o mecanismo normativo de concorrência é exclusivamente ETag e If-Match. Nenhum cliente deve enviar row_version ou expected_row_version em payloads de criação ou atualização. Divergências de versão retornam VERSION_CONFLICT. A revogação global de sessões é o comando POST /sessions/revocations, exigindo sessão autenticada, reautenticação e Idempotency-Key.</w:t>
       </w:r>
     </w:p>
     <w:p>
@@ -7052,7 +7052,7 @@
     <w:p>
       <w:pPr/>
       <w:r>
-        <w:t>A Especificação Funcional 02.33 permanece normativa para regras de negócio, privacidade e estados não definidos no contrato HTTP. A OpenAPI 02.33.8 prevalece para rotas, métodos, cabeçalhos, payloads, schemas, enums, códigos HTTP e operationId. DTOs, clientes, documentação Swagger e testes de contrato devem ser derivados ou validados contra esse arquivo; endpoints fora do contrato são proibidos.</w:t>
+        <w:t>A Especificação Funcional 02.33 permanece normativa para regras de negócio, privacidade e estados não definidos no contrato HTTP. A OpenAPI 02.33.9 prevalece para rotas, métodos, cabeçalhos, payloads, schemas, enums, códigos HTTP e operationId. DTOs, clientes, documentação Swagger e testes de contrato devem ser derivados ou validados contra esse arquivo; endpoints fora do contrato são proibidos.</w:t>
       </w:r>
     </w:p>
     <w:p>

</xml_diff>

<commit_message>
wip: DEC-038 motivo do tratamento (OpenAPI 02.33.10 e matriz; falta Especificacao, AGENTS e codigo)
Co-Authored-By: Claude Opus 5.5 <noreply@anthropic.com>
Claude-Session: https://claude.ai/code/session_017rNdJgpe4PD9X2bVXfNRL5
</commit_message>
<xml_diff>
--- a/ADR-001_Arquitetura_Base_MeuRemedio_v1.5.docx
+++ b/ADR-001_Arquitetura_Base_MeuRemedio_v1.5.docx
@@ -404,7 +404,7 @@
               <w:rPr>
                 <w:b w:val="0"/>
               </w:rPr>
-              <w:t>Especificação Funcional 02.33 DEV-FINAL, OpenAPI 02.33.9 e ADR-001 v1.5</w:t>
+              <w:t>Especificação Funcional 02.33 DEV-FINAL, OpenAPI 02.33.10 e ADR-001 v1.5</w:t>
             </w:r>
           </w:p>
         </w:tc>
@@ -681,7 +681,7 @@
               <w:rPr>
                 <w:b w:val="0"/>
               </w:rPr>
-              <w:t>OpenAPI 3.1.1 versão 02.33.9 permanece como fonte normativa para rotas, payloads, respostas, concorrência, comandos e testes de contrato.</w:t>
+              <w:t>OpenAPI 3.1.1 versão 02.33.10 permanece como fonte normativa para rotas, payloads, respostas, concorrência, comandos e testes de contrato.</w:t>
             </w:r>
           </w:p>
         </w:tc>
@@ -1944,7 +1944,7 @@
               <w:rPr>
                 <w:b w:val="0"/>
               </w:rPr>
-              <w:t>OpenAPI 3.1.1 contract-first, versão normativa 02.33.9</w:t>
+              <w:t>OpenAPI 3.1.1 contract-first, versão normativa 02.33.10</w:t>
             </w:r>
           </w:p>
         </w:tc>
@@ -3229,7 +3229,7 @@
               <w:rPr>
                 <w:b w:val="0"/>
               </w:rPr>
-              <w:t>Nenhuma rota ou payload sem correspondência na OpenAPI 02.33.9 normativa. Divergência bloqueia a CI.</w:t>
+              <w:t>Nenhuma rota ou payload sem correspondência na OpenAPI 02.33.10 normativa. Divergência bloqueia a CI.</w:t>
             </w:r>
           </w:p>
         </w:tc>
@@ -4410,7 +4410,7 @@
     </w:p>
     <w:p>
       <w:r>
-        <w:t>Cada teste deve portar os IDs normativos correspondentes. A CI deve falhar quando houver requisito sem teste, referência inexistente ou implementação divergente da OpenAPI 02.33.9.</w:t>
+        <w:t>Cada teste deve portar os IDs normativos correspondentes. A CI deve falhar quando houver requisito sem teste, referência inexistente ou implementação divergente da OpenAPI 02.33.10.</w:t>
       </w:r>
     </w:p>
     <w:p>
@@ -4426,7 +4426,7 @@
         <w:pStyle w:val="ListNumber"/>
       </w:pPr>
       <w:r>
-        <w:t>O agente lê a Especificação Funcional 02.33, a OpenAPI 02.33.9, esta ADR e o AGENTS.md.</w:t>
+        <w:t>O agente lê a Especificação Funcional 02.33, a OpenAPI 02.33.10, esta ADR e o AGENTS.md.</w:t>
       </w:r>
     </w:p>
     <w:p>
@@ -5496,7 +5496,7 @@
               <w:rPr>
                 <w:b w:val="0"/>
               </w:rPr>
-              <w:t>NestJS + OpenAPI 3.1.1 (02.33.9)</w:t>
+              <w:t>NestJS + OpenAPI 3.1.1 (02.33.10)</w:t>
             </w:r>
           </w:p>
         </w:tc>
@@ -7010,7 +7010,7 @@
     <w:p>
       <w:pPr/>
       <w:r>
-        <w:t>A OpenAPI 02.33.9 é a fonte normativa da superfície HTTP. Recursos versionados utilizam ETag nas respostas e If-Match nas operações de atualização. O row_version é gerenciado internamente pela persistência e pode ser apresentado nas representações de leitura para rastreabilidade e depuração operacional. Nas operações de escrita, o mecanismo normativo de concorrência é exclusivamente ETag e If-Match. Nenhum cliente deve enviar row_version ou expected_row_version em payloads de criação ou atualização. Divergências de versão retornam VERSION_CONFLICT. A revogação global de sessões é o comando POST /sessions/revocations, exigindo sessão autenticada, reautenticação e Idempotency-Key.</w:t>
+        <w:t>A OpenAPI 02.33.10 é a fonte normativa da superfície HTTP. Recursos versionados utilizam ETag nas respostas e If-Match nas operações de atualização. O row_version é gerenciado internamente pela persistência e pode ser apresentado nas representações de leitura para rastreabilidade e depuração operacional. Nas operações de escrita, o mecanismo normativo de concorrência é exclusivamente ETag e If-Match. Nenhum cliente deve enviar row_version ou expected_row_version em payloads de criação ou atualização. Divergências de versão retornam VERSION_CONFLICT. A revogação global de sessões é o comando POST /sessions/revocations, exigindo sessão autenticada, reautenticação e Idempotency-Key.</w:t>
       </w:r>
     </w:p>
     <w:p>
@@ -7052,7 +7052,7 @@
     <w:p>
       <w:pPr/>
       <w:r>
-        <w:t>A Especificação Funcional 02.33 permanece normativa para regras de negócio, privacidade e estados não definidos no contrato HTTP. A OpenAPI 02.33.9 prevalece para rotas, métodos, cabeçalhos, payloads, schemas, enums, códigos HTTP e operationId. DTOs, clientes, documentação Swagger e testes de contrato devem ser derivados ou validados contra esse arquivo; endpoints fora do contrato são proibidos.</w:t>
+        <w:t>A Especificação Funcional 02.33 permanece normativa para regras de negócio, privacidade e estados não definidos no contrato HTTP. A OpenAPI 02.33.10 prevalece para rotas, métodos, cabeçalhos, payloads, schemas, enums, códigos HTTP e operationId. DTOs, clientes, documentação Swagger e testes de contrato devem ser derivados ou validados contra esse arquivo; endpoints fora do contrato são proibidos.</w:t>
       </w:r>
     </w:p>
     <w:p>

</xml_diff>